<commit_message>
docs: add stateless cart section to Modul 4 report
</commit_message>
<xml_diff>
--- a/056_PutraSuyapratama_Laporan_Modul4.docx
+++ b/056_PutraSuyapratama_Laporan_Modul4.docx
@@ -3315,6 +3315,283 @@
         <w:t>ot diperlukan untuk membuktikan alur penggunaan dan hasil implementasi secara visual.</w:t>
       </w:r>
     </w:p>
+    <w:p>
+      <w:r>
+        <w:br w:type="page"/>
+      </w:r>
+    </w:p>
+    <w:p>
+      <w:pPr>
+        <w:pStyle w:val="Heading1"/>
+      </w:pPr>
+      <w:r>
+        <w:t>Modul 4 Bagian 2 ? Stateless Shopping Cart</w:t>
+      </w:r>
+    </w:p>
+    <w:p>
+      <w:r>
+        <w:t>Bagian ini mendokumentasikan implementasi Stateless Shopping Cart pada project tugas-toko-online. State keranjang dikirim dari browser melalui payload request pada setiap operasi. Laravel tidak menyimpan cart pada session, cookie, atau database.</w:t>
+      </w:r>
+    </w:p>
+    <w:p>
+      <w:pPr>
+        <w:pStyle w:val="Heading2"/>
+      </w:pPr>
+      <w:r>
+        <w:t>1. Hasil Pengerjaan</w:t>
+      </w:r>
+    </w:p>
+    <w:p>
+      <w:r>
+        <w:t>Fitur yang dibuat menggunakan endpoint POST /cart/add. Ketika tombol Tambah ke keranjang diklik, JavaScript mengirim cart sebelumnya dan product_id produk yang dipilih. Server mengambil harga dan stok dari database, menambahkan jumlah produk, menghitung subtotal serta total, kemudian mengembalikan response JSON. State terbaru hanya disimpan pada variabel JavaScript selama halaman masih terbuka.</w:t>
+      </w:r>
+    </w:p>
+    <w:p>
+      <w:r>
+        <w:t>Data seeder yang digunakan sesuai instruksi adalah Buku Tulis Rp5.000, Pulpen Rp3.000, dan Penggaris Rp4.000.</w:t>
+      </w:r>
+    </w:p>
+    <w:p>
+      <w:pPr>
+        <w:pStyle w:val="Heading2"/>
+      </w:pPr>
+      <w:r>
+        <w:t>2. Tangkapan Layar Utama</w:t>
+      </w:r>
+    </w:p>
+    <w:p>
+      <w:r>
+        <w:t>Tampilan katalog setelah operasi tambah barang berhasil:</w:t>
+      </w:r>
+    </w:p>
+    <w:p>
+      <w:pPr>
+        <w:jc w:val="center"/>
+      </w:pPr>
+      <w:r>
+        <w:drawing>
+          <wp:inline xmlns:a="http://schemas.openxmlformats.org/drawingml/2006/main" xmlns:pic="http://schemas.openxmlformats.org/drawingml/2006/picture">
+            <wp:extent cx="5669280" cy="4389008"/>
+            <wp:docPr id="23" name="Picture 23"/>
+            <wp:cNvGraphicFramePr>
+              <a:graphicFrameLocks noChangeAspect="1"/>
+            </wp:cNvGraphicFramePr>
+            <a:graphic>
+              <a:graphicData uri="http://schemas.openxmlformats.org/drawingml/2006/picture">
+                <pic:pic>
+                  <pic:nvPicPr>
+                    <pic:cNvPr id="0" name="stateless-cart-screenshot.png"/>
+                    <pic:cNvPicPr/>
+                  </pic:nvPicPr>
+                  <pic:blipFill>
+                    <a:blip r:embed="rId23"/>
+                    <a:stretch>
+                      <a:fillRect/>
+                    </a:stretch>
+                  </pic:blipFill>
+                  <pic:spPr>
+                    <a:xfrm>
+                      <a:off x="0" y="0"/>
+                      <a:ext cx="5669280" cy="4389008"/>
+                    </a:xfrm>
+                    <a:prstGeom prst="rect"/>
+                  </pic:spPr>
+                </pic:pic>
+              </a:graphicData>
+            </a:graphic>
+          </wp:inline>
+        </w:drawing>
+      </w:r>
+    </w:p>
+    <w:p>
+      <w:pPr>
+        <w:jc w:val="center"/>
+      </w:pPr>
+      <w:r>
+        <w:t>Gambar 1. Katalog produk dan ringkasan cart stateless.</w:t>
+      </w:r>
+    </w:p>
+    <w:p>
+      <w:pPr>
+        <w:pStyle w:val="Heading2"/>
+      </w:pPr>
+      <w:r>
+        <w:t>3. Request Payload dan Response</w:t>
+      </w:r>
+    </w:p>
+    <w:p>
+      <w:r>
+        <w:t>Request pada DevTools ? Network saat menekan tombol Tambah:</w:t>
+      </w:r>
+    </w:p>
+    <w:p>
+      <w:pPr>
+        <w:ind w:left="504"/>
+      </w:pPr>
+      <w:r>
+        <w:rPr>
+          <w:rFonts w:ascii="Courier New" w:hAnsi="Courier New"/>
+          <w:sz w:val="18"/>
+        </w:rPr>
+        <w:t>POST /cart/add</w:t>
+        <w:br/>
+        <w:t>Content-Type: application/json</w:t>
+        <w:br/>
+        <w:br/>
+        <w:t>{</w:t>
+        <w:br/>
+        <w:t xml:space="preserve">  "cart": {"1": 2},</w:t>
+        <w:br/>
+        <w:t xml:space="preserve">  "product_id": 2</w:t>
+        <w:br/>
+        <w:t>}</w:t>
+      </w:r>
+    </w:p>
+    <w:p>
+      <w:r>
+        <w:t>Payload berisi dua Buku Tulis pada cart sebelumnya dan product_id 2 untuk menambahkan satu Pulpen. Response dari server:</w:t>
+      </w:r>
+    </w:p>
+    <w:p>
+      <w:pPr>
+        <w:ind w:left="504"/>
+      </w:pPr>
+      <w:r>
+        <w:rPr>
+          <w:rFonts w:ascii="Courier New" w:hAnsi="Courier New"/>
+          <w:sz w:val="18"/>
+        </w:rPr>
+        <w:t>{</w:t>
+        <w:br/>
+        <w:t xml:space="preserve">  "cart": {"1": 2, "2": 1},</w:t>
+        <w:br/>
+        <w:t xml:space="preserve">  "items": [</w:t>
+        <w:br/>
+        <w:t xml:space="preserve">    {"product_id": 1, "product": "Buku Tulis", "quantity": 2, "subtotal": 10000},</w:t>
+        <w:br/>
+        <w:t xml:space="preserve">    {"product_id": 2, "product": "Pulpen", "quantity": 1, "subtotal": 3000}</w:t>
+        <w:br/>
+        <w:t xml:space="preserve">  ],</w:t>
+        <w:br/>
+        <w:t xml:space="preserve">  "total": 13000</w:t>
+        <w:br/>
+        <w:t>}</w:t>
+      </w:r>
+    </w:p>
+    <w:p>
+      <w:r>
+        <w:t>Response menunjukkan dua Buku Tulis dan satu Pulpen dengan total Rp13.000. Harga dan subtotal dihitung menggunakan data produk pada database, bukan nilai harga yang dikirim oleh browser.</w:t>
+      </w:r>
+    </w:p>
+    <w:p>
+      <w:pPr>
+        <w:pStyle w:val="Heading2"/>
+      </w:pPr>
+      <w:r>
+        <w:t>4. Tahap 6 ? Mengamati Operasi Stateless</w:t>
+      </w:r>
+    </w:p>
+    <w:p>
+      <w:pPr>
+        <w:pStyle w:val="ListNumber"/>
+      </w:pPr>
+      <w:r>
+        <w:t>Buka DevTools ? Network, klik tombol Tambah, lalu buka request POST /cart/add. Request Payload memperlihatkan cart sebelumnya dan product_id.</w:t>
+      </w:r>
+    </w:p>
+    <w:p>
+      <w:pPr>
+        <w:pStyle w:val="ListNumber"/>
+      </w:pPr>
+      <w:r>
+        <w:t>Response memperlihatkan cart setelah penambahan, daftar item, subtotal setiap item, dan total keseluruhan.</w:t>
+      </w:r>
+    </w:p>
+    <w:p>
+      <w:pPr>
+        <w:pStyle w:val="ListNumber"/>
+      </w:pPr>
+      <w:r>
+        <w:t>Refresh halaman. Keranjang kembali kosong karena variabel JavaScript cart tidak disimpan ke localStorage, cookie, session, atau database.</w:t>
+      </w:r>
+    </w:p>
+    <w:p>
+      <w:pPr>
+        <w:pStyle w:val="ListNumber"/>
+      </w:pPr>
+      <w:r>
+        <w:t>Kirim payload yang sama berulang kali melalui Postman dengan CSRF token yang valid. Response tetap sama selama payload dan data database yang digunakan sama.</w:t>
+      </w:r>
+    </w:p>
+    <w:p>
+      <w:r>
+        <w:t>Karena route berada pada web.php, request dari Postman harus menyertakan token CSRF yang valid. Pada aplikasi browser, token dikirim melalui header X-CSRF-TOKEN.</w:t>
+      </w:r>
+    </w:p>
+    <w:p>
+      <w:pPr>
+        <w:pStyle w:val="Heading2"/>
+      </w:pPr>
+      <w:r>
+        <w:t>5. Jawaban Diskusi</w:t>
+      </w:r>
+    </w:p>
+    <w:p>
+      <w:r>
+        <w:rPr>
+          <w:b/>
+        </w:rPr>
+        <w:t xml:space="preserve">Di mana state keranjang berada? </w:t>
+      </w:r>
+      <w:r>
+        <w:t>State keranjang berada pada variabel JavaScript di browser. Browser mengirimkan state tersebut pada payload setiap kali melakukan operasi cart.</w:t>
+      </w:r>
+    </w:p>
+    <w:p>
+      <w:r>
+        <w:rPr>
+          <w:b/>
+        </w:rPr>
+        <w:t xml:space="preserve">Mengapa keranjang hilang setelah refresh? </w:t>
+      </w:r>
+      <w:r>
+        <w:t>Refresh membuat halaman dan variabel JavaScript dari awal. Karena cart tidak disimpan pada localStorage, cookie, session, atau database, server tidak menerima state cart dan menampilkan keranjang kosong.</w:t>
+      </w:r>
+    </w:p>
+    <w:p>
+      <w:r>
+        <w:rPr>
+          <w:b/>
+        </w:rPr>
+        <w:t xml:space="preserve">Mengapa server tidak boleh langsung mempercayai data browser? </w:t>
+      </w:r>
+      <w:r>
+        <w:t>Data browser dapat diubah oleh pengguna. Pengguna dapat memalsukan harga atau jumlah. Server harus memvalidasi product_id dan quantity, mengambil harga serta stok terbaru dari database, lalu menghitung ulang subtotal dan total.</w:t>
+      </w:r>
+    </w:p>
+    <w:p>
+      <w:pPr>
+        <w:pStyle w:val="Heading2"/>
+      </w:pPr>
+      <w:r>
+        <w:t>6. Lesson Learned: Stateful vs Stateless</w:t>
+      </w:r>
+    </w:p>
+    <w:p>
+      <w:r>
+        <w:t>Stateful menyimpan state pada server, misalnya session cart. Request berikutnya dapat mengambil kembali state tersebut tanpa mengirim seluruh isi cart. Pendekatan ini nyaman bagi pengguna, tetapi membutuhkan pengelolaan session dan penyimpanan state pada server.</w:t>
+      </w:r>
+    </w:p>
+    <w:p>
+      <w:r>
+        <w:t>Stateless tidak menyimpan state cart antar-request. Setiap request membawa konteks yang diperlukan sehingga alur lebih mudah diskalakan dan tidak bergantung pada session. Konsekuensinya, client harus mengirim ulang state pada setiap operasi dan state dapat hilang ketika halaman di-refresh atau ditutup jika tidak dipersistenkan.</w:t>
+      </w:r>
+    </w:p>
+    <w:p>
+      <w:r>
+        <w:t>Kesimpulan pembelajaran: server tetap menjadi sumber kebenaran untuk harga, stok, subtotal, dan total. Browser hanya mengirim usulan state cart, sedangkan keputusan akhir dan validasi selalu dilakukan oleh Laravel.</w:t>
+      </w:r>
+    </w:p>
     <w:sectPr>
       <w:pgSz w:w="12240" w:h="15840"/>
       <w:pgMar w:top="1152" w:right="1440" w:bottom="1152" w:left="1440" w:header="720" w:footer="720" w:gutter="0"/>

</xml_diff>